<commit_message>
Update final report wording
</commit_message>
<xml_diff>
--- a/Documentation/CST1510_Coursework_2_Technical_Report_Shihad_Shibchurn.docx
+++ b/Documentation/CST1510_Coursework_2_Technical_Report_Shihad_Shibchurn.docx
@@ -2097,6 +2097,9 @@
     </w:p>
     <w:p>
       <w:r>
+        <w:rPr>
+          <w:noProof/>
+        </w:rPr>
         <w:drawing>
           <wp:inline distT="0" distB="0" distL="0" distR="0" wp14:anchorId="432E70E5" wp14:editId="70893C8D">
             <wp:extent cx="6309360" cy="4572635"/>
@@ -2242,39 +2245,33 @@
     <w:p>
       <w:proofErr w:type="spellStart"/>
       <w:r>
-        <w:t>SmartBoyAI</w:t>
+        <w:t>SmartBoyAI provides a protected chat interface for questions about cybersecurity incidents, IT tickets and dataset metadata. The assistant is guided by a system prompt, scope checks and database context to answer only dashboard-related questions. It also reminds users not to enter their passwords, API keys, or any other sensitive personal information.</w:t>
       </w:r>
       <w:proofErr w:type="spellEnd"/>
-      <w:r>
-        <w:t xml:space="preserve"> provides a protected chat interface for questions about cybersecurity incidents, IT tickets and dataset metadata. </w:t>
-      </w:r>
-      <w:r>
-        <w:t xml:space="preserve">The assistant has been fine tuned to answer only dashboard related </w:t>
-      </w:r>
+      <w:r/>
+      <w:r/>
       <w:proofErr w:type="gramStart"/>
-      <w:r>
-        <w:t>questions(</w:t>
-      </w:r>
+      <w:r/>
+      <w:r/>
       <w:proofErr w:type="gramEnd"/>
-      <w:r>
-        <w:t xml:space="preserve">like the CISA, cyber security incidents </w:t>
-      </w:r>
+      <w:r/>
+      <w:proofErr w:type="gramStart"/>
+      <w:r/>
+      <w:proofErr w:type="gramEnd"/>
+      <w:r/>
+      <w:r/>
+      <w:proofErr w:type="gramStart"/>
+      <w:r/>
+      <w:proofErr w:type="gramEnd"/>
+      <w:r/>
       <w:proofErr w:type="spellStart"/>
-      <w:r>
-        <w:t>etc</w:t>
-      </w:r>
+      <w:r/>
       <w:proofErr w:type="spellEnd"/>
-      <w:r>
-        <w:t xml:space="preserve">). It also reminds users </w:t>
-      </w:r>
+      <w:r/>
       <w:proofErr w:type="gramStart"/>
-      <w:r>
-        <w:t>no</w:t>
-      </w:r>
+      <w:r/>
       <w:proofErr w:type="gramEnd"/>
-      <w:r>
-        <w:t xml:space="preserve"> to input their passwords, API keys, or any other sensitive personal information.</w:t>
-      </w:r>
+      <w:r/>
     </w:p>
     <w:p>
       <w:r>
@@ -2289,15 +2286,7 @@
       </w:r>
       <w:proofErr w:type="gramEnd"/>
       <w:r>
-        <w:t xml:space="preserve"> does not disclose information that it does not have access to and streams the reply in a natural manner. Therefore, the chat interface helps to demonstrate both the API usage and the ability to combine the language model’s </w:t>
-      </w:r>
-      <w:proofErr w:type="spellStart"/>
-      <w:r>
-        <w:t>responses</w:t>
-      </w:r>
-      <w:proofErr w:type="spellEnd"/>
-      <w:r>
-        <w:t xml:space="preserve"> with the database content.</w:t>
+        <w:t xml:space="preserve"> does not disclose information that it does not have access to and streams the reply in a natural manner. Therefore, the chat interface helps to demonstrate both the API usage and the ability to combine the language model’s responses with the database content.</w:t>
       </w:r>
     </w:p>
     <w:p>
@@ -4053,263 +4042,81 @@
       </w:r>
     </w:p>
     <w:p>
-      <w:pPr>
-        <w:rPr>
-          <w:rFonts w:ascii="Aptos" w:eastAsiaTheme="minorEastAsia" w:hAnsi="Aptos" w:cstheme="minorBidi"/>
-          <w:b w:val="0"/>
-          <w:bCs w:val="0"/>
-          <w:color w:val="auto"/>
-          <w:sz w:val="21"/>
-          <w:szCs w:val="22"/>
-        </w:rPr>
-      </w:pPr>
-      <w:r>
-        <w:rPr>
-          <w:rFonts w:ascii="Aptos" w:eastAsiaTheme="minorEastAsia" w:hAnsi="Aptos" w:cstheme="minorBidi"/>
-          <w:b w:val="0"/>
-          <w:bCs w:val="0"/>
-          <w:color w:val="auto"/>
-          <w:sz w:val="21"/>
-          <w:szCs w:val="22"/>
-        </w:rPr>
+      <w:r>
         <w:t xml:space="preserve">One of the challenges was to ensure that authentication and permissions were consistent throughout the </w:t>
       </w:r>
       <w:proofErr w:type="spellStart"/>
       <w:r>
-        <w:rPr>
-          <w:rFonts w:ascii="Aptos" w:eastAsiaTheme="minorEastAsia" w:hAnsi="Aptos" w:cstheme="minorBidi"/>
-          <w:b w:val="0"/>
-          <w:bCs w:val="0"/>
-          <w:color w:val="auto"/>
-          <w:sz w:val="21"/>
-          <w:szCs w:val="22"/>
-        </w:rPr>
         <w:t>Streamlit</w:t>
       </w:r>
       <w:proofErr w:type="spellEnd"/>
       <w:r>
-        <w:rPr>
-          <w:rFonts w:ascii="Aptos" w:eastAsiaTheme="minorEastAsia" w:hAnsi="Aptos" w:cstheme="minorBidi"/>
-          <w:b w:val="0"/>
-          <w:bCs w:val="0"/>
-          <w:color w:val="auto"/>
-          <w:sz w:val="21"/>
-          <w:szCs w:val="22"/>
-        </w:rPr>
         <w:t xml:space="preserve"> app, as a page could not rely on its visibility in the navigation to determine whether it should be open or not. Each protected page had to check the session state, and the administrative functions additionally required a separate role check in SQLite.</w:t>
       </w:r>
     </w:p>
     <w:p>
-      <w:pPr>
-        <w:rPr>
-          <w:rFonts w:ascii="Aptos" w:eastAsiaTheme="minorEastAsia" w:hAnsi="Aptos" w:cstheme="minorBidi"/>
-          <w:b w:val="0"/>
-          <w:bCs w:val="0"/>
-          <w:color w:val="auto"/>
-          <w:sz w:val="21"/>
-          <w:szCs w:val="22"/>
-        </w:rPr>
-      </w:pPr>
-      <w:r>
-        <w:rPr>
-          <w:rFonts w:ascii="Aptos" w:eastAsiaTheme="minorEastAsia" w:hAnsi="Aptos" w:cstheme="minorBidi"/>
-          <w:b w:val="0"/>
-          <w:bCs w:val="0"/>
-          <w:color w:val="auto"/>
-          <w:sz w:val="21"/>
-          <w:szCs w:val="22"/>
-        </w:rPr>
+      <w:r>
         <w:t xml:space="preserve">Another challenge was the implementation of the Saved Results viewer. The dashboard called the </w:t>
       </w:r>
       <w:proofErr w:type="spellStart"/>
       <w:r>
-        <w:rPr>
-          <w:rFonts w:ascii="Aptos" w:eastAsiaTheme="minorEastAsia" w:hAnsi="Aptos" w:cstheme="minorBidi"/>
-          <w:b w:val="0"/>
-          <w:bCs w:val="0"/>
-          <w:color w:val="auto"/>
-          <w:sz w:val="21"/>
-          <w:szCs w:val="22"/>
-        </w:rPr>
         <w:t>get_saved_</w:t>
       </w:r>
       <w:proofErr w:type="gramStart"/>
       <w:r>
-        <w:rPr>
-          <w:rFonts w:ascii="Aptos" w:eastAsiaTheme="minorEastAsia" w:hAnsi="Aptos" w:cstheme="minorBidi"/>
-          <w:b w:val="0"/>
-          <w:bCs w:val="0"/>
-          <w:color w:val="auto"/>
-          <w:sz w:val="21"/>
-          <w:szCs w:val="22"/>
-        </w:rPr>
         <w:t>results</w:t>
       </w:r>
       <w:proofErr w:type="spellEnd"/>
       <w:r>
-        <w:rPr>
-          <w:rFonts w:ascii="Aptos" w:eastAsiaTheme="minorEastAsia" w:hAnsi="Aptos" w:cstheme="minorBidi"/>
-          <w:b w:val="0"/>
-          <w:bCs w:val="0"/>
-          <w:color w:val="auto"/>
-          <w:sz w:val="21"/>
-          <w:szCs w:val="22"/>
-        </w:rPr>
         <w:t>(</w:t>
       </w:r>
       <w:proofErr w:type="gramEnd"/>
       <w:r>
-        <w:rPr>
-          <w:rFonts w:ascii="Aptos" w:eastAsiaTheme="minorEastAsia" w:hAnsi="Aptos" w:cstheme="minorBidi"/>
-          <w:b w:val="0"/>
-          <w:bCs w:val="0"/>
-          <w:color w:val="auto"/>
-          <w:sz w:val="21"/>
-          <w:szCs w:val="22"/>
-        </w:rPr>
         <w:t xml:space="preserve">) function, but the export service did not originally feature a list display. The service had a single-result export function, which was mistakenly implemented twice. The solution involved adding a </w:t>
       </w:r>
       <w:proofErr w:type="spellStart"/>
       <w:r>
-        <w:rPr>
-          <w:rFonts w:ascii="Aptos" w:eastAsiaTheme="minorEastAsia" w:hAnsi="Aptos" w:cstheme="minorBidi"/>
-          <w:b w:val="0"/>
-          <w:bCs w:val="0"/>
-          <w:color w:val="auto"/>
-          <w:sz w:val="21"/>
-          <w:szCs w:val="22"/>
-        </w:rPr>
         <w:t>parameterised</w:t>
       </w:r>
       <w:proofErr w:type="spellEnd"/>
       <w:r>
-        <w:rPr>
-          <w:rFonts w:ascii="Aptos" w:eastAsiaTheme="minorEastAsia" w:hAnsi="Aptos" w:cstheme="minorBidi"/>
-          <w:b w:val="0"/>
-          <w:bCs w:val="0"/>
-          <w:color w:val="auto"/>
-          <w:sz w:val="21"/>
-          <w:szCs w:val="22"/>
-        </w:rPr>
         <w:t xml:space="preserve"> list display to the service, refactoring the single-result export function, and testing the owner check against both test and production databases.</w:t>
       </w:r>
     </w:p>
     <w:p>
-      <w:pPr>
-        <w:rPr>
-          <w:rFonts w:ascii="Aptos" w:eastAsiaTheme="minorEastAsia" w:hAnsi="Aptos" w:cstheme="minorBidi"/>
-          <w:b w:val="0"/>
-          <w:bCs w:val="0"/>
-          <w:color w:val="auto"/>
-          <w:sz w:val="21"/>
-          <w:szCs w:val="22"/>
-        </w:rPr>
-      </w:pPr>
-      <w:r>
-        <w:rPr>
-          <w:rFonts w:ascii="Aptos" w:eastAsiaTheme="minorEastAsia" w:hAnsi="Aptos" w:cstheme="minorBidi"/>
-          <w:b w:val="0"/>
-          <w:bCs w:val="0"/>
-          <w:color w:val="auto"/>
-          <w:sz w:val="21"/>
-          <w:szCs w:val="22"/>
-        </w:rPr>
+      <w:r>
         <w:t xml:space="preserve">The final challenge was to enhance </w:t>
       </w:r>
       <w:proofErr w:type="spellStart"/>
       <w:r>
-        <w:rPr>
-          <w:rFonts w:ascii="Aptos" w:eastAsiaTheme="minorEastAsia" w:hAnsi="Aptos" w:cstheme="minorBidi"/>
-          <w:b w:val="0"/>
-          <w:bCs w:val="0"/>
-          <w:color w:val="auto"/>
-          <w:sz w:val="21"/>
-          <w:szCs w:val="22"/>
-        </w:rPr>
         <w:t>SmartBoyAI’s</w:t>
       </w:r>
       <w:proofErr w:type="spellEnd"/>
       <w:r>
-        <w:rPr>
-          <w:rFonts w:ascii="Aptos" w:eastAsiaTheme="minorEastAsia" w:hAnsi="Aptos" w:cstheme="minorBidi"/>
-          <w:b w:val="0"/>
-          <w:bCs w:val="0"/>
-          <w:color w:val="auto"/>
-          <w:sz w:val="21"/>
-          <w:szCs w:val="22"/>
-        </w:rPr>
         <w:t xml:space="preserve"> performance without eliminating its database awareness. The initial implementation of the API call did not </w:t>
       </w:r>
       <w:proofErr w:type="spellStart"/>
       <w:r>
-        <w:rPr>
-          <w:rFonts w:ascii="Aptos" w:eastAsiaTheme="minorEastAsia" w:hAnsi="Aptos" w:cstheme="minorBidi"/>
-          <w:b w:val="0"/>
-          <w:bCs w:val="0"/>
-          <w:color w:val="auto"/>
-          <w:sz w:val="21"/>
-          <w:szCs w:val="22"/>
-        </w:rPr>
         <w:t>utilise</w:t>
       </w:r>
       <w:proofErr w:type="spellEnd"/>
       <w:r>
-        <w:rPr>
-          <w:rFonts w:ascii="Aptos" w:eastAsiaTheme="minorEastAsia" w:hAnsi="Aptos" w:cstheme="minorBidi"/>
-          <w:b w:val="0"/>
-          <w:bCs w:val="0"/>
-          <w:color w:val="auto"/>
-          <w:sz w:val="21"/>
-          <w:szCs w:val="22"/>
-        </w:rPr>
         <w:t xml:space="preserve"> streaming and waited for the entire response before outputting anything. Streaming was implemented by iterating through the </w:t>
       </w:r>
       <w:proofErr w:type="spellStart"/>
       <w:r>
-        <w:rPr>
-          <w:rFonts w:ascii="Aptos" w:eastAsiaTheme="minorEastAsia" w:hAnsi="Aptos" w:cstheme="minorBidi"/>
-          <w:b w:val="0"/>
-          <w:bCs w:val="0"/>
-          <w:color w:val="auto"/>
-          <w:sz w:val="21"/>
-          <w:szCs w:val="22"/>
-        </w:rPr>
         <w:t>Groq</w:t>
       </w:r>
       <w:proofErr w:type="spellEnd"/>
       <w:r>
-        <w:rPr>
-          <w:rFonts w:ascii="Aptos" w:eastAsiaTheme="minorEastAsia" w:hAnsi="Aptos" w:cstheme="minorBidi"/>
-          <w:b w:val="0"/>
-          <w:bCs w:val="0"/>
-          <w:color w:val="auto"/>
-          <w:sz w:val="21"/>
-          <w:szCs w:val="22"/>
-        </w:rPr>
         <w:t xml:space="preserve"> response chunks, updating the </w:t>
       </w:r>
       <w:proofErr w:type="spellStart"/>
       <w:r>
-        <w:rPr>
-          <w:rFonts w:ascii="Aptos" w:eastAsiaTheme="minorEastAsia" w:hAnsi="Aptos" w:cstheme="minorBidi"/>
-          <w:b w:val="0"/>
-          <w:bCs w:val="0"/>
-          <w:color w:val="auto"/>
-          <w:sz w:val="21"/>
-          <w:szCs w:val="22"/>
-        </w:rPr>
         <w:t>Streamlit</w:t>
       </w:r>
       <w:proofErr w:type="spellEnd"/>
       <w:r>
-        <w:rPr>
-          <w:rFonts w:ascii="Aptos" w:eastAsiaTheme="minorEastAsia" w:hAnsi="Aptos" w:cstheme="minorBidi"/>
-          <w:b w:val="0"/>
-          <w:bCs w:val="0"/>
-          <w:color w:val="auto"/>
-          <w:sz w:val="21"/>
-          <w:szCs w:val="22"/>
-        </w:rPr>
         <w:t xml:space="preserve"> placeholder, and reconstructing the final response before saving it to the session history</w:t>
       </w:r>
     </w:p>
@@ -4326,19 +4133,13 @@
         <w:pStyle w:val="ListBullet"/>
       </w:pPr>
       <w:r>
-        <w:t>Expand the IT Operations and Dataset Metadata dashboard tabs into fuller standalone dashboards later, with more filters and deeper visual analysis</w:t>
-      </w:r>
-      <w:r>
-        <w:t xml:space="preserve"> as they are currently in a single page which his </w:t>
-      </w:r>
+        <w:t>Expand the IT Operations and Dataset Metadata dashboard tabs into fuller standalone dashboards later, with more filters and deeper visual analysis as they are currently in a single page which is more focused on cyber incidents.</w:t>
+      </w:r>
+      <w:r/>
       <w:proofErr w:type="gramStart"/>
-      <w:r>
-        <w:t>more  focused</w:t>
-      </w:r>
+      <w:r/>
       <w:proofErr w:type="gramEnd"/>
-      <w:r>
-        <w:t xml:space="preserve"> on cyber incidents.</w:t>
-      </w:r>
+      <w:r/>
     </w:p>
     <w:p>
       <w:pPr>
@@ -4417,157 +4218,49 @@
       </w:r>
     </w:p>
     <w:p>
-      <w:pPr>
-        <w:rPr>
-          <w:rFonts w:ascii="Aptos" w:eastAsiaTheme="minorEastAsia" w:hAnsi="Aptos" w:cstheme="minorBidi"/>
-          <w:b w:val="0"/>
-          <w:bCs w:val="0"/>
-          <w:color w:val="auto"/>
-          <w:sz w:val="21"/>
-          <w:szCs w:val="22"/>
-        </w:rPr>
-      </w:pPr>
-      <w:r>
-        <w:rPr>
-          <w:rFonts w:ascii="Aptos" w:eastAsiaTheme="minorEastAsia" w:hAnsi="Aptos" w:cstheme="minorBidi"/>
-          <w:b w:val="0"/>
-          <w:bCs w:val="0"/>
-          <w:color w:val="auto"/>
-          <w:sz w:val="21"/>
-          <w:szCs w:val="22"/>
-        </w:rPr>
+      <w:r>
         <w:t xml:space="preserve">The final version of the platform was created using </w:t>
       </w:r>
       <w:proofErr w:type="gramStart"/>
       <w:r>
-        <w:rPr>
-          <w:rFonts w:ascii="Aptos" w:eastAsiaTheme="minorEastAsia" w:hAnsi="Aptos" w:cstheme="minorBidi"/>
-          <w:b w:val="0"/>
-          <w:bCs w:val="0"/>
-          <w:color w:val="auto"/>
-          <w:sz w:val="21"/>
-          <w:szCs w:val="22"/>
-        </w:rPr>
         <w:t xml:space="preserve">the </w:t>
       </w:r>
       <w:proofErr w:type="spellStart"/>
       <w:r>
-        <w:rPr>
-          <w:rFonts w:ascii="Aptos" w:eastAsiaTheme="minorEastAsia" w:hAnsi="Aptos" w:cstheme="minorBidi"/>
-          <w:b w:val="0"/>
-          <w:bCs w:val="0"/>
-          <w:color w:val="auto"/>
-          <w:sz w:val="21"/>
-          <w:szCs w:val="22"/>
-        </w:rPr>
         <w:t>bcrypt</w:t>
       </w:r>
       <w:proofErr w:type="spellEnd"/>
       <w:proofErr w:type="gramEnd"/>
       <w:r>
-        <w:rPr>
-          <w:rFonts w:ascii="Aptos" w:eastAsiaTheme="minorEastAsia" w:hAnsi="Aptos" w:cstheme="minorBidi"/>
-          <w:b w:val="0"/>
-          <w:bCs w:val="0"/>
-          <w:color w:val="auto"/>
-          <w:sz w:val="21"/>
-          <w:szCs w:val="22"/>
-        </w:rPr>
         <w:t xml:space="preserve"> authentication, SQLite database, </w:t>
       </w:r>
       <w:proofErr w:type="gramStart"/>
       <w:r>
-        <w:rPr>
-          <w:rFonts w:ascii="Aptos" w:eastAsiaTheme="minorEastAsia" w:hAnsi="Aptos" w:cstheme="minorBidi"/>
-          <w:b w:val="0"/>
-          <w:bCs w:val="0"/>
-          <w:color w:val="auto"/>
-          <w:sz w:val="21"/>
-          <w:szCs w:val="22"/>
-        </w:rPr>
         <w:t>pandas</w:t>
       </w:r>
       <w:proofErr w:type="gramEnd"/>
       <w:r>
-        <w:rPr>
-          <w:rFonts w:ascii="Aptos" w:eastAsiaTheme="minorEastAsia" w:hAnsi="Aptos" w:cstheme="minorBidi"/>
-          <w:b w:val="0"/>
-          <w:bCs w:val="0"/>
-          <w:color w:val="auto"/>
-          <w:sz w:val="21"/>
-          <w:szCs w:val="22"/>
-        </w:rPr>
         <w:t xml:space="preserve"> migration, Rich cli, protected </w:t>
       </w:r>
       <w:proofErr w:type="spellStart"/>
       <w:r>
-        <w:rPr>
-          <w:rFonts w:ascii="Aptos" w:eastAsiaTheme="minorEastAsia" w:hAnsi="Aptos" w:cstheme="minorBidi"/>
-          <w:b w:val="0"/>
-          <w:bCs w:val="0"/>
-          <w:color w:val="auto"/>
-          <w:sz w:val="21"/>
-          <w:szCs w:val="22"/>
-        </w:rPr>
         <w:t>Streamlit</w:t>
       </w:r>
       <w:proofErr w:type="spellEnd"/>
       <w:r>
-        <w:rPr>
-          <w:rFonts w:ascii="Aptos" w:eastAsiaTheme="minorEastAsia" w:hAnsi="Aptos" w:cstheme="minorBidi"/>
-          <w:b w:val="0"/>
-          <w:bCs w:val="0"/>
-          <w:color w:val="auto"/>
-          <w:sz w:val="21"/>
-          <w:szCs w:val="22"/>
-        </w:rPr>
         <w:t xml:space="preserve"> app, and </w:t>
       </w:r>
       <w:proofErr w:type="spellStart"/>
       <w:r>
-        <w:rPr>
-          <w:rFonts w:ascii="Aptos" w:eastAsiaTheme="minorEastAsia" w:hAnsi="Aptos" w:cstheme="minorBidi"/>
-          <w:b w:val="0"/>
-          <w:bCs w:val="0"/>
-          <w:color w:val="auto"/>
-          <w:sz w:val="21"/>
-          <w:szCs w:val="22"/>
-        </w:rPr>
         <w:t>Groq</w:t>
       </w:r>
       <w:proofErr w:type="spellEnd"/>
       <w:r>
-        <w:rPr>
-          <w:rFonts w:ascii="Aptos" w:eastAsiaTheme="minorEastAsia" w:hAnsi="Aptos" w:cstheme="minorBidi"/>
-          <w:b w:val="0"/>
-          <w:bCs w:val="0"/>
-          <w:color w:val="auto"/>
-          <w:sz w:val="21"/>
-          <w:szCs w:val="22"/>
-        </w:rPr>
         <w:t xml:space="preserve"> streaming based assistant. All the required data (users, cybersecurity, datasets, and tickets) were placed in the shared database, while multiple functions allowed account management, query dashboards, and result storage.</w:t>
       </w:r>
     </w:p>
     <w:p>
-      <w:pPr>
-        <w:rPr>
-          <w:rFonts w:ascii="Aptos" w:eastAsiaTheme="minorEastAsia" w:hAnsi="Aptos" w:cstheme="minorBidi"/>
-          <w:b w:val="0"/>
-          <w:bCs w:val="0"/>
-          <w:color w:val="auto"/>
-          <w:sz w:val="21"/>
-          <w:szCs w:val="22"/>
-        </w:rPr>
-      </w:pPr>
-      <w:r>
-        <w:rPr>
-          <w:rFonts w:ascii="Aptos" w:eastAsiaTheme="minorEastAsia" w:hAnsi="Aptos" w:cstheme="minorBidi"/>
-          <w:b w:val="0"/>
-          <w:bCs w:val="0"/>
-          <w:color w:val="auto"/>
-          <w:sz w:val="21"/>
-          <w:szCs w:val="22"/>
-        </w:rPr>
+      <w:r>
         <w:t>The project fulfilled the main objective of creating a secure integrated platform for multi-domain intelligence and included various additional features such as role-based administration, recovery options, two-factor authentication, CISA KEV tracking, cli exports, and others. The most interesting experience was the insight into the creation of the system, which includes multiple security, data, interface, and AI elements and successfully unites them into one whole.</w:t>
       </w:r>
     </w:p>
@@ -4580,166 +4273,16 @@
       </w:r>
     </w:p>
     <w:p>
-      <w:pPr>
-        <w:rPr>
-          <w:rFonts w:ascii="Aptos" w:eastAsiaTheme="minorEastAsia" w:hAnsi="Aptos" w:cstheme="minorBidi"/>
-          <w:b w:val="0"/>
-          <w:bCs w:val="0"/>
-          <w:color w:val="auto"/>
-          <w:sz w:val="21"/>
-          <w:szCs w:val="22"/>
-        </w:rPr>
-      </w:pPr>
-      <w:r>
-        <w:rPr>
-          <w:rFonts w:ascii="Aptos" w:eastAsiaTheme="minorEastAsia" w:hAnsi="Aptos" w:cstheme="minorBidi"/>
-          <w:b w:val="0"/>
-          <w:bCs w:val="0"/>
-          <w:color w:val="auto"/>
-          <w:sz w:val="21"/>
-          <w:szCs w:val="22"/>
-        </w:rPr>
-        <w:t>C</w:t>
-      </w:r>
-      <w:r>
-        <w:rPr>
-          <w:rFonts w:ascii="Aptos" w:eastAsiaTheme="minorEastAsia" w:hAnsi="Aptos" w:cstheme="minorBidi"/>
-          <w:b w:val="0"/>
-          <w:bCs w:val="0"/>
-          <w:color w:val="auto"/>
-          <w:sz w:val="21"/>
-          <w:szCs w:val="22"/>
-        </w:rPr>
-        <w:t>hatGPT was used as an aid in development for planning, code reviews, debugging, validation, documentation organization, refactoring recommendations, and edge case consideration</w:t>
-      </w:r>
-      <w:r>
-        <w:rPr>
-          <w:rFonts w:ascii="Aptos" w:eastAsiaTheme="minorEastAsia" w:hAnsi="Aptos" w:cstheme="minorBidi"/>
-          <w:b w:val="0"/>
-          <w:bCs w:val="0"/>
-          <w:color w:val="auto"/>
-          <w:sz w:val="21"/>
-          <w:szCs w:val="22"/>
-        </w:rPr>
-        <w:t xml:space="preserve">. </w:t>
-      </w:r>
-      <w:proofErr w:type="gramStart"/>
-      <w:r>
-        <w:rPr>
-          <w:rFonts w:ascii="Aptos" w:eastAsiaTheme="minorEastAsia" w:hAnsi="Aptos" w:cstheme="minorBidi"/>
-          <w:b w:val="0"/>
-          <w:bCs w:val="0"/>
-          <w:color w:val="auto"/>
-          <w:sz w:val="21"/>
-          <w:szCs w:val="22"/>
-        </w:rPr>
-        <w:t>Specific</w:t>
-      </w:r>
-      <w:proofErr w:type="gramEnd"/>
-      <w:r>
-        <w:rPr>
-          <w:rFonts w:ascii="Aptos" w:eastAsiaTheme="minorEastAsia" w:hAnsi="Aptos" w:cstheme="minorBidi"/>
-          <w:b w:val="0"/>
-          <w:bCs w:val="0"/>
-          <w:color w:val="auto"/>
-          <w:sz w:val="21"/>
-          <w:szCs w:val="22"/>
-        </w:rPr>
-        <w:t xml:space="preserve"> examples</w:t>
-      </w:r>
-      <w:r>
-        <w:rPr>
-          <w:rFonts w:ascii="Aptos" w:eastAsiaTheme="minorEastAsia" w:hAnsi="Aptos" w:cstheme="minorBidi"/>
-          <w:b w:val="0"/>
-          <w:bCs w:val="0"/>
-          <w:color w:val="auto"/>
-          <w:sz w:val="21"/>
-          <w:szCs w:val="22"/>
-        </w:rPr>
-        <w:t xml:space="preserve"> of this include reviewing the Saved Results service, implementing streamed </w:t>
-      </w:r>
+      <w:r>
+        <w:t>OpenAI ChatGPT and OpenAI Codex were used as assistive tools during the development of this coursework for planning, debugging, code review, refactoring suggestions, validation and documentation support. This assistance also included reviewing and refining the password visibility controls and the compact IT Operations and Dataset Metadata dashboard tabs during final testing. All AI-assisted suggestions were manually reviewed, adapted, tested and integrated by the author, who remains responsible for the final implementation.</w:t>
+      </w:r>
+      <w:r/>
+      <w:r/>
+      <w:r/>
       <w:proofErr w:type="spellStart"/>
-      <w:r>
-        <w:rPr>
-          <w:rFonts w:ascii="Aptos" w:eastAsiaTheme="minorEastAsia" w:hAnsi="Aptos" w:cstheme="minorBidi"/>
-          <w:b w:val="0"/>
-          <w:bCs w:val="0"/>
-          <w:color w:val="auto"/>
-          <w:sz w:val="21"/>
-          <w:szCs w:val="22"/>
-        </w:rPr>
-        <w:t>Groq</w:t>
-      </w:r>
+      <w:r/>
       <w:proofErr w:type="spellEnd"/>
-      <w:r>
-        <w:rPr>
-          <w:rFonts w:ascii="Aptos" w:eastAsiaTheme="minorEastAsia" w:hAnsi="Aptos" w:cstheme="minorBidi"/>
-          <w:b w:val="0"/>
-          <w:bCs w:val="0"/>
-          <w:color w:val="auto"/>
-          <w:sz w:val="21"/>
-          <w:szCs w:val="22"/>
-        </w:rPr>
-        <w:t xml:space="preserve"> responses, exposing existing export helpers via the CLI, and auditing the project against the coursework requirements.</w:t>
-      </w:r>
-    </w:p>
-    <w:p>
-      <w:pPr>
-        <w:rPr>
-          <w:rFonts w:ascii="Aptos" w:eastAsiaTheme="minorEastAsia" w:hAnsi="Aptos" w:cstheme="minorBidi"/>
-          <w:b w:val="0"/>
-          <w:bCs w:val="0"/>
-          <w:color w:val="auto"/>
-          <w:sz w:val="21"/>
-          <w:szCs w:val="22"/>
-        </w:rPr>
-      </w:pPr>
-      <w:r>
-        <w:rPr>
-          <w:rFonts w:ascii="Aptos" w:eastAsiaTheme="minorEastAsia" w:hAnsi="Aptos" w:cstheme="minorBidi"/>
-          <w:b w:val="0"/>
-          <w:bCs w:val="0"/>
-          <w:color w:val="auto"/>
-          <w:sz w:val="21"/>
-          <w:szCs w:val="22"/>
-        </w:rPr>
-        <w:t xml:space="preserve">Any output generated with AI assistance was reviewed, adapted, and tested prior to being incorporated into the project. The final decisions, implementations, demonstrations, and submissions </w:t>
-      </w:r>
-      <w:r>
-        <w:rPr>
-          <w:rFonts w:ascii="Aptos" w:eastAsiaTheme="minorEastAsia" w:hAnsi="Aptos" w:cstheme="minorBidi"/>
-          <w:b w:val="0"/>
-          <w:bCs w:val="0"/>
-          <w:color w:val="auto"/>
-          <w:sz w:val="21"/>
-          <w:szCs w:val="22"/>
-        </w:rPr>
-        <w:t xml:space="preserve">were all </w:t>
-      </w:r>
-      <w:proofErr w:type="gramStart"/>
-      <w:r>
-        <w:rPr>
-          <w:rFonts w:ascii="Aptos" w:eastAsiaTheme="minorEastAsia" w:hAnsi="Aptos" w:cstheme="minorBidi"/>
-          <w:b w:val="0"/>
-          <w:bCs w:val="0"/>
-          <w:color w:val="auto"/>
-          <w:sz w:val="21"/>
-          <w:szCs w:val="22"/>
-        </w:rPr>
-        <w:t>done</w:t>
-      </w:r>
-      <w:proofErr w:type="gramEnd"/>
-      <w:r>
-        <w:rPr>
-          <w:rFonts w:ascii="Aptos" w:eastAsiaTheme="minorEastAsia" w:hAnsi="Aptos" w:cstheme="minorBidi"/>
-          <w:b w:val="0"/>
-          <w:bCs w:val="0"/>
-          <w:color w:val="auto"/>
-          <w:sz w:val="21"/>
-          <w:szCs w:val="22"/>
-        </w:rPr>
-        <w:t xml:space="preserve"> by me.</w:t>
-      </w:r>
+      <w:r/>
     </w:p>
     <w:p>
       <w:pPr>
@@ -5814,7 +5357,6 @@
   <w:style w:type="character" w:default="1" w:styleId="DefaultParagraphFont">
     <w:name w:val="Default Paragraph Font"/>
     <w:uiPriority w:val="1"/>
-    <w:semiHidden/>
     <w:unhideWhenUsed/>
   </w:style>
   <w:style w:type="table" w:default="1" w:styleId="TableNormal">

</xml_diff>